<commit_message>
Render requisition-brief (commit-hash/date Document Control: 359810f)
</commit_message>
<xml_diff>
--- a/gantry-workspace/ai-engineer/out/AI Engineer - Requisition Brief.docx
+++ b/gantry-workspace/ai-engineer/out/AI Engineer - Requisition Brief.docx
@@ -2,7 +2,7 @@
 <file path=word/document.xml><?xml version="1.0" encoding="utf-8"?>
 <w:document xmlns:w="http://schemas.openxmlformats.org/wordprocessingml/2006/main" xmlns:m="http://schemas.openxmlformats.org/officeDocument/2006/math" xmlns:r="http://schemas.openxmlformats.org/officeDocument/2006/relationships" xmlns:o="urn:schemas-microsoft-com:office:office" xmlns:v="urn:schemas-microsoft-com:vml" xmlns:w10="urn:schemas-microsoft-com:office:word" xmlns:a="http://schemas.openxmlformats.org/drawingml/2006/main" xmlns:pic="http://schemas.openxmlformats.org/drawingml/2006/picture" xmlns:wp="http://schemas.openxmlformats.org/drawingml/2006/wordprocessingDrawing">
   <w:body>
-    <w:bookmarkStart w:id="22" w:name="ai-engineer-requisition-brief"/>
+    <w:bookmarkStart w:id="31" w:name="ai-engineer-requisition-brief"/>
     <w:p>
       <w:pPr>
         <w:pStyle w:val="Heading1"/>
@@ -11,7 +11,7 @@
         <w:t xml:space="preserve">ai-engineer: Requisition Brief</w:t>
       </w:r>
     </w:p>
-    <w:bookmarkStart w:id="20" w:name="document-control"/>
+    <w:bookmarkStart w:id="29" w:name="document-control"/>
     <w:p>
       <w:pPr>
         <w:pStyle w:val="Heading2"/>
@@ -23,7 +23,8 @@
     <w:tbl>
       <w:tblPr>
         <w:tblStyle w:val="Table"/>
-        <w:tblW w:type="auto" w:w="0"/>
+        <w:tblW w:type="pct" w:w="5000"/>
+        <w:tblLayout w:type="fixed"/>
         <w:tblLook w:firstRow="1" w:lastRow="0" w:firstColumn="0" w:lastColumn="0" w:noHBand="0" w:noVBand="0" w:val="0020"/>
       </w:tblPr>
       <w:tblGrid>
@@ -32,14 +33,13 @@
       </w:tblGrid>
       <w:tr>
         <w:trPr>
-          <w:tblHeader w:val="true"/>
+          <w:tblHeader w:val="on"/>
         </w:trPr>
         <w:tc>
           <w:tcPr/>
           <w:p>
             <w:pPr>
               <w:pStyle w:val="Compact"/>
-              <w:jc w:val="left"/>
             </w:pPr>
             <w:r>
               <w:t xml:space="preserve">Field</w:t>
@@ -51,7 +51,6 @@
           <w:p>
             <w:pPr>
               <w:pStyle w:val="Compact"/>
-              <w:jc w:val="left"/>
             </w:pPr>
             <w:r>
               <w:t xml:space="preserve">Value</w:t>
@@ -65,7 +64,6 @@
           <w:p>
             <w:pPr>
               <w:pStyle w:val="Compact"/>
-              <w:jc w:val="left"/>
             </w:pPr>
             <w:r>
               <w:t xml:space="preserve">Version</w:t>
@@ -77,7 +75,6 @@
           <w:p>
             <w:pPr>
               <w:pStyle w:val="Compact"/>
-              <w:jc w:val="left"/>
             </w:pPr>
             <w:r>
               <w:t xml:space="preserve">recruitment-onboarding v3 · Requisition</w:t>
@@ -91,7 +88,6 @@
           <w:p>
             <w:pPr>
               <w:pStyle w:val="Compact"/>
-              <w:jc w:val="left"/>
             </w:pPr>
             <w:r>
               <w:t xml:space="preserve">Date</w:t>
@@ -104,6 +100,9 @@
             <w:pPr>
               <w:pStyle w:val="Compact"/>
             </w:pPr>
+            <w:r>
+              <w:t xml:space="preserve">2026-09-26</w:t>
+            </w:r>
           </w:p>
         </w:tc>
       </w:tr>
@@ -113,7 +112,6 @@
           <w:p>
             <w:pPr>
               <w:pStyle w:val="Compact"/>
-              <w:jc w:val="left"/>
             </w:pPr>
             <w:r>
               <w:t xml:space="preserve">Commit</w:t>
@@ -126,6 +124,14 @@
             <w:pPr>
               <w:pStyle w:val="Compact"/>
             </w:pPr>
+            <w:hyperlink r:id="rId28">
+              <w:r>
+                <w:rPr>
+                  <w:rStyle w:val="VerbatimChar"/>
+                </w:rPr>
+                <w:t xml:space="preserve">359810f</w:t>
+              </w:r>
+            </w:hyperlink>
           </w:p>
         </w:tc>
       </w:tr>
@@ -135,7 +141,6 @@
           <w:p>
             <w:pPr>
               <w:pStyle w:val="Compact"/>
-              <w:jc w:val="left"/>
             </w:pPr>
             <w:r>
               <w:t xml:space="preserve">Status</w:t>
@@ -147,7 +152,6 @@
           <w:p>
             <w:pPr>
               <w:pStyle w:val="Compact"/>
-              <w:jc w:val="left"/>
             </w:pPr>
             <w:r>
               <w:t xml:space="preserve">Draft</w:t>
@@ -156,8 +160,8 @@
         </w:tc>
       </w:tr>
     </w:tbl>
-    <w:bookmarkEnd w:id="20"/>
-    <w:bookmarkStart w:id="21" w:name="review-sign-off"/>
+    <w:bookmarkEnd w:id="29"/>
+    <w:bookmarkStart w:id="30" w:name="review-sign-off"/>
     <w:p>
       <w:pPr>
         <w:pStyle w:val="Heading2"/>
@@ -182,14 +186,13 @@
       </w:tblGrid>
       <w:tr>
         <w:trPr>
-          <w:tblHeader w:val="true"/>
+          <w:tblHeader w:val="on"/>
         </w:trPr>
         <w:tc>
           <w:tcPr/>
           <w:p>
             <w:pPr>
               <w:pStyle w:val="Compact"/>
-              <w:jc w:val="left"/>
             </w:pPr>
             <w:r>
               <w:t xml:space="preserve">Name</w:t>
@@ -201,7 +204,6 @@
           <w:p>
             <w:pPr>
               <w:pStyle w:val="Compact"/>
-              <w:jc w:val="left"/>
             </w:pPr>
             <w:r>
               <w:t xml:space="preserve">Role / Title</w:t>
@@ -213,7 +215,6 @@
           <w:p>
             <w:pPr>
               <w:pStyle w:val="Compact"/>
-              <w:jc w:val="left"/>
             </w:pPr>
             <w:r>
               <w:t xml:space="preserve">Date</w:t>
@@ -225,7 +226,6 @@
           <w:p>
             <w:pPr>
               <w:pStyle w:val="Compact"/>
-              <w:jc w:val="left"/>
             </w:pPr>
             <w:r>
               <w:t xml:space="preserve">Review process</w:t>
@@ -237,7 +237,6 @@
           <w:p>
             <w:pPr>
               <w:pStyle w:val="Compact"/>
-              <w:jc w:val="left"/>
             </w:pPr>
             <w:r>
               <w:t xml:space="preserve">Status</w:t>
@@ -249,7 +248,6 @@
           <w:p>
             <w:pPr>
               <w:pStyle w:val="Compact"/>
-              <w:jc w:val="left"/>
             </w:pPr>
             <w:r>
               <w:t xml:space="preserve">Reference</w:t>
@@ -295,7 +293,6 @@
           <w:p>
             <w:pPr>
               <w:pStyle w:val="Compact"/>
-              <w:jc w:val="left"/>
             </w:pPr>
             <w:r>
               <w:t xml:space="preserve">Pending</w:t>
@@ -312,9 +309,9 @@
         </w:tc>
       </w:tr>
     </w:tbl>
-    <w:bookmarkEnd w:id="21"/>
-    <w:bookmarkEnd w:id="22"/>
-    <w:bookmarkStart w:id="27" w:name="the-role"/>
+    <w:bookmarkEnd w:id="30"/>
+    <w:bookmarkEnd w:id="31"/>
+    <w:bookmarkStart w:id="36" w:name="the-role"/>
     <w:p>
       <w:pPr>
         <w:pStyle w:val="Heading1"/>
@@ -323,7 +320,7 @@
         <w:t xml:space="preserve">The role</w:t>
       </w:r>
     </w:p>
-    <w:bookmarkStart w:id="23" w:name="role-summary"/>
+    <w:bookmarkStart w:id="32" w:name="role-summary"/>
     <w:p>
       <w:pPr>
         <w:pStyle w:val="Heading2"/>
@@ -340,8 +337,8 @@
         <w:t xml:space="preserve">— n/a —</w:t>
       </w:r>
     </w:p>
-    <w:bookmarkEnd w:id="23"/>
-    <w:bookmarkStart w:id="24" w:name="team-and-reporting-line"/>
+    <w:bookmarkEnd w:id="32"/>
+    <w:bookmarkStart w:id="33" w:name="team-and-reporting-line"/>
     <w:p>
       <w:pPr>
         <w:pStyle w:val="Heading2"/>
@@ -358,8 +355,8 @@
         <w:t xml:space="preserve">— n/a —</w:t>
       </w:r>
     </w:p>
-    <w:bookmarkEnd w:id="24"/>
-    <w:bookmarkStart w:id="25" w:name="key-responsibilities"/>
+    <w:bookmarkEnd w:id="33"/>
+    <w:bookmarkStart w:id="34" w:name="key-responsibilities"/>
     <w:p>
       <w:pPr>
         <w:pStyle w:val="Heading2"/>
@@ -368,8 +365,8 @@
         <w:t xml:space="preserve">Key responsibilities</w:t>
       </w:r>
     </w:p>
-    <w:bookmarkEnd w:id="25"/>
-    <w:bookmarkStart w:id="26" w:name="justification"/>
+    <w:bookmarkEnd w:id="34"/>
+    <w:bookmarkStart w:id="35" w:name="justification"/>
     <w:p>
       <w:pPr>
         <w:pStyle w:val="Heading2"/>
@@ -386,9 +383,9 @@
         <w:t xml:space="preserve">— n/a —</w:t>
       </w:r>
     </w:p>
-    <w:bookmarkEnd w:id="26"/>
-    <w:bookmarkEnd w:id="27"/>
-    <w:bookmarkStart w:id="31" w:name="engagement"/>
+    <w:bookmarkEnd w:id="35"/>
+    <w:bookmarkEnd w:id="36"/>
+    <w:bookmarkStart w:id="40" w:name="engagement"/>
     <w:p>
       <w:pPr>
         <w:pStyle w:val="Heading1"/>
@@ -397,7 +394,7 @@
         <w:t xml:space="preserve">Engagement</w:t>
       </w:r>
     </w:p>
-    <w:bookmarkStart w:id="28" w:name="engagement-type"/>
+    <w:bookmarkStart w:id="37" w:name="engagement-type"/>
     <w:p>
       <w:pPr>
         <w:pStyle w:val="Heading2"/>
@@ -414,8 +411,8 @@
         <w:t xml:space="preserve">— n/a —</w:t>
       </w:r>
     </w:p>
-    <w:bookmarkEnd w:id="28"/>
-    <w:bookmarkStart w:id="29" w:name="rationale"/>
+    <w:bookmarkEnd w:id="37"/>
+    <w:bookmarkStart w:id="38" w:name="rationale"/>
     <w:p>
       <w:pPr>
         <w:pStyle w:val="Heading2"/>
@@ -432,8 +429,8 @@
         <w:t xml:space="preserve">— n/a —</w:t>
       </w:r>
     </w:p>
-    <w:bookmarkEnd w:id="29"/>
-    <w:bookmarkStart w:id="30" w:name="Xf58ffec67de27dad2479f3f19eda26c5e0c7af1"/>
+    <w:bookmarkEnd w:id="38"/>
+    <w:bookmarkStart w:id="39" w:name="Xf58ffec67de27dad2479f3f19eda26c5e0c7af1"/>
     <w:p>
       <w:pPr>
         <w:pStyle w:val="Heading2"/>
@@ -450,9 +447,9 @@
         <w:t xml:space="preserve">— not stated —</w:t>
       </w:r>
     </w:p>
-    <w:bookmarkEnd w:id="30"/>
-    <w:bookmarkEnd w:id="31"/>
-    <w:bookmarkStart w:id="33" w:name="role-evaluation"/>
+    <w:bookmarkEnd w:id="39"/>
+    <w:bookmarkEnd w:id="40"/>
+    <w:bookmarkStart w:id="42" w:name="role-evaluation"/>
     <w:p>
       <w:pPr>
         <w:pStyle w:val="Heading1"/>
@@ -461,7 +458,7 @@
         <w:t xml:space="preserve">Role evaluation</w:t>
       </w:r>
     </w:p>
-    <w:bookmarkStart w:id="32" w:name="outcome"/>
+    <w:bookmarkStart w:id="41" w:name="outcome"/>
     <w:p>
       <w:pPr>
         <w:pStyle w:val="Heading2"/>
@@ -478,9 +475,9 @@
         <w:t xml:space="preserve">— n/a —</w:t>
       </w:r>
     </w:p>
-    <w:bookmarkEnd w:id="32"/>
-    <w:bookmarkEnd w:id="33"/>
-    <w:bookmarkStart w:id="34" w:name="how-the-role-was-evaluated"/>
+    <w:bookmarkEnd w:id="41"/>
+    <w:bookmarkEnd w:id="42"/>
+    <w:bookmarkStart w:id="43" w:name="how-the-role-was-evaluated"/>
     <w:p>
       <w:pPr>
         <w:pStyle w:val="Heading1"/>
@@ -497,13 +494,13 @@
         <w:t xml:space="preserve">— n/a —</w:t>
       </w:r>
     </w:p>
-    <w:bookmarkEnd w:id="34"/>
+    <w:bookmarkEnd w:id="43"/>
     <w:sectPr>
-      <w:headerReference r:id="rId11" w:type="even"/>
-      <w:headerReference r:id="rId10" w:type="default"/>
-      <w:footerReference r:id="rId12" w:type="default"/>
-      <w:headerReference r:id="rId9" w:type="first"/>
-      <w:footerReference r:id="rId13" w:type="first"/>
+      <w:headerReference r:id="rId15" w:type="even"/>
+      <w:headerReference r:id="rId16" w:type="default"/>
+      <w:footerReference r:id="rId17" w:type="default"/>
+      <w:headerReference r:id="rId18" w:type="first"/>
+      <w:footerReference r:id="rId19" w:type="first"/>
       <w:pgSz w:code="9" w:h="16838" w:w="11906"/>
       <w:pgMar w:bottom="1440" w:footer="709" w:gutter="0" w:header="709" w:left="1440" w:right="1440" w:top="1440"/>
       <w:cols w:space="708"/>
@@ -4690,14 +4687,14 @@
     </w:lvl>
   </w:abstractNum>
   <w:abstractNum w:abstractNumId="990">
-    <w:nsid w:val="A990"/>
+    <w:nsid w:val="0000A990"/>
     <w:multiLevelType w:val="multilevel"/>
     <w:lvl w:ilvl="0">
       <w:numFmt w:val="bullet"/>
       <w:lvlText w:val=" "/>
       <w:lvlJc w:val="left"/>
       <w:pPr>
-        <w:ind w:left="720" w:hanging="480"/>
+        <w:ind w:left="720" w:hanging="360"/>
       </w:pPr>
     </w:lvl>
     <w:lvl w:ilvl="1">
@@ -4705,7 +4702,7 @@
       <w:lvlText w:val=" "/>
       <w:lvlJc w:val="left"/>
       <w:pPr>
-        <w:ind w:left="1440" w:hanging="480"/>
+        <w:ind w:left="1440" w:hanging="360"/>
       </w:pPr>
     </w:lvl>
     <w:lvl w:ilvl="2">
@@ -4713,7 +4710,7 @@
       <w:lvlText w:val=" "/>
       <w:lvlJc w:val="left"/>
       <w:pPr>
-        <w:ind w:left="2160" w:hanging="480"/>
+        <w:ind w:left="2160" w:hanging="360"/>
       </w:pPr>
     </w:lvl>
     <w:lvl w:ilvl="3">
@@ -4721,7 +4718,7 @@
       <w:lvlText w:val=" "/>
       <w:lvlJc w:val="left"/>
       <w:pPr>
-        <w:ind w:left="2880" w:hanging="480"/>
+        <w:ind w:left="2880" w:hanging="360"/>
       </w:pPr>
     </w:lvl>
     <w:lvl w:ilvl="4">
@@ -4729,7 +4726,7 @@
       <w:lvlText w:val=" "/>
       <w:lvlJc w:val="left"/>
       <w:pPr>
-        <w:ind w:left="3600" w:hanging="480"/>
+        <w:ind w:left="3600" w:hanging="360"/>
       </w:pPr>
     </w:lvl>
     <w:lvl w:ilvl="5">
@@ -4737,7 +4734,7 @@
       <w:lvlText w:val=" "/>
       <w:lvlJc w:val="left"/>
       <w:pPr>
-        <w:ind w:left="4320" w:hanging="480"/>
+        <w:ind w:left="4320" w:hanging="360"/>
       </w:pPr>
     </w:lvl>
     <w:lvl w:ilvl="6">
@@ -4745,7 +4742,7 @@
       <w:lvlText w:val=" "/>
       <w:lvlJc w:val="left"/>
       <w:pPr>
-        <w:ind w:left="5040" w:hanging="480"/>
+        <w:ind w:left="5040" w:hanging="360"/>
       </w:pPr>
     </w:lvl>
     <w:lvl w:ilvl="7">
@@ -4753,7 +4750,7 @@
       <w:lvlText w:val=" "/>
       <w:lvlJc w:val="left"/>
       <w:pPr>
-        <w:ind w:left="5760" w:hanging="480"/>
+        <w:ind w:left="5760" w:hanging="360"/>
       </w:pPr>
     </w:lvl>
     <w:lvl w:ilvl="8">
@@ -4761,7 +4758,7 @@
       <w:lvlText w:val=" "/>
       <w:lvlJc w:val="left"/>
       <w:pPr>
-        <w:ind w:left="6480" w:hanging="480"/>
+        <w:ind w:left="6480" w:hanging="360"/>
       </w:pPr>
     </w:lvl>
   </w:abstractNum>
@@ -21040,8 +21037,8 @@
     <w:name w:val="KeywordTok"/>
     <w:basedOn w:val="VerbatimChar"/>
     <w:rPr>
+      <w:b/>
       <w:color w:val="007020"/>
-      <w:b/>
     </w:rPr>
   </w:style>
   <w:style w:type="character" w:customStyle="1" w:styleId="DataTypeTok">
@@ -21118,42 +21115,42 @@
     <w:name w:val="ImportTok"/>
     <w:basedOn w:val="VerbatimChar"/>
     <w:rPr>
+      <w:b/>
       <w:color w:val="008000"/>
-      <w:b/>
     </w:rPr>
   </w:style>
   <w:style w:type="character" w:customStyle="1" w:styleId="CommentTok">
     <w:name w:val="CommentTok"/>
     <w:basedOn w:val="VerbatimChar"/>
     <w:rPr>
+      <w:i/>
       <w:color w:val="60a0b0"/>
-      <w:i/>
     </w:rPr>
   </w:style>
   <w:style w:type="character" w:customStyle="1" w:styleId="DocumentationTok">
     <w:name w:val="DocumentationTok"/>
     <w:basedOn w:val="VerbatimChar"/>
     <w:rPr>
+      <w:i/>
       <w:color w:val="ba2121"/>
-      <w:i/>
     </w:rPr>
   </w:style>
   <w:style w:type="character" w:customStyle="1" w:styleId="AnnotationTok">
     <w:name w:val="AnnotationTok"/>
     <w:basedOn w:val="VerbatimChar"/>
     <w:rPr>
-      <w:color w:val="60a0b0"/>
       <w:b/>
       <w:i/>
+      <w:color w:val="60a0b0"/>
     </w:rPr>
   </w:style>
   <w:style w:type="character" w:customStyle="1" w:styleId="CommentVarTok">
     <w:name w:val="CommentVarTok"/>
     <w:basedOn w:val="VerbatimChar"/>
     <w:rPr>
-      <w:color w:val="60a0b0"/>
       <w:b/>
       <w:i/>
+      <w:color w:val="60a0b0"/>
     </w:rPr>
   </w:style>
   <w:style w:type="character" w:customStyle="1" w:styleId="OtherTok">
@@ -21181,8 +21178,8 @@
     <w:name w:val="ControlFlowTok"/>
     <w:basedOn w:val="VerbatimChar"/>
     <w:rPr>
+      <w:b/>
       <w:color w:val="007020"/>
-      <w:b/>
     </w:rPr>
   </w:style>
   <w:style w:type="character" w:customStyle="1" w:styleId="OperatorTok">
@@ -21227,34 +21224,34 @@
     <w:name w:val="InformationTok"/>
     <w:basedOn w:val="VerbatimChar"/>
     <w:rPr>
-      <w:color w:val="60a0b0"/>
       <w:b/>
       <w:i/>
+      <w:color w:val="60a0b0"/>
     </w:rPr>
   </w:style>
   <w:style w:type="character" w:customStyle="1" w:styleId="WarningTok">
     <w:name w:val="WarningTok"/>
     <w:basedOn w:val="VerbatimChar"/>
     <w:rPr>
-      <w:color w:val="60a0b0"/>
       <w:b/>
       <w:i/>
+      <w:color w:val="60a0b0"/>
     </w:rPr>
   </w:style>
   <w:style w:type="character" w:customStyle="1" w:styleId="AlertTok">
     <w:name w:val="AlertTok"/>
     <w:basedOn w:val="VerbatimChar"/>
     <w:rPr>
+      <w:b/>
       <w:color w:val="ff0000"/>
-      <w:b/>
     </w:rPr>
   </w:style>
   <w:style w:type="character" w:customStyle="1" w:styleId="ErrorTok">
     <w:name w:val="ErrorTok"/>
     <w:basedOn w:val="VerbatimChar"/>
     <w:rPr>
+      <w:b/>
       <w:color w:val="ff0000"/>
-      <w:b/>
     </w:rPr>
   </w:style>
   <w:style w:type="character" w:customStyle="1" w:styleId="NormalTok">

</xml_diff>

<commit_message>
Render requisition-brief (commit-hash/date Document Control: d30827b)
</commit_message>
<xml_diff>
--- a/gantry-workspace/ai-engineer/out/AI Engineer - Requisition Brief.docx
+++ b/gantry-workspace/ai-engineer/out/AI Engineer - Requisition Brief.docx
@@ -2,7 +2,7 @@
 <file path=word/document.xml><?xml version="1.0" encoding="utf-8"?>
 <w:document xmlns:w="http://schemas.openxmlformats.org/wordprocessingml/2006/main" xmlns:m="http://schemas.openxmlformats.org/officeDocument/2006/math" xmlns:r="http://schemas.openxmlformats.org/officeDocument/2006/relationships" xmlns:o="urn:schemas-microsoft-com:office:office" xmlns:v="urn:schemas-microsoft-com:vml" xmlns:w10="urn:schemas-microsoft-com:office:word" xmlns:a="http://schemas.openxmlformats.org/drawingml/2006/main" xmlns:pic="http://schemas.openxmlformats.org/drawingml/2006/picture" xmlns:wp="http://schemas.openxmlformats.org/drawingml/2006/wordprocessingDrawing">
   <w:body>
-    <w:bookmarkStart w:id="22" w:name="ai-engineer-requisition-brief"/>
+    <w:bookmarkStart w:id="31" w:name="ai-engineer-requisition-brief"/>
     <w:p>
       <w:pPr>
         <w:pStyle w:val="Heading1"/>
@@ -11,7 +11,7 @@
         <w:t xml:space="preserve">ai-engineer: Requisition Brief</w:t>
       </w:r>
     </w:p>
-    <w:bookmarkStart w:id="20" w:name="document-control"/>
+    <w:bookmarkStart w:id="29" w:name="document-control"/>
     <w:p>
       <w:pPr>
         <w:pStyle w:val="Heading2"/>
@@ -23,7 +23,8 @@
     <w:tbl>
       <w:tblPr>
         <w:tblStyle w:val="Table"/>
-        <w:tblW w:type="auto" w:w="0"/>
+        <w:tblW w:type="pct" w:w="5000"/>
+        <w:tblLayout w:type="fixed"/>
         <w:tblLook w:firstRow="1" w:lastRow="0" w:firstColumn="0" w:lastColumn="0" w:noHBand="0" w:noVBand="0" w:val="0020"/>
       </w:tblPr>
       <w:tblGrid>
@@ -32,14 +33,13 @@
       </w:tblGrid>
       <w:tr>
         <w:trPr>
-          <w:tblHeader w:val="true"/>
+          <w:tblHeader w:val="on"/>
         </w:trPr>
         <w:tc>
           <w:tcPr/>
           <w:p>
             <w:pPr>
               <w:pStyle w:val="Compact"/>
-              <w:jc w:val="left"/>
             </w:pPr>
             <w:r>
               <w:t xml:space="preserve">Field</w:t>
@@ -51,7 +51,6 @@
           <w:p>
             <w:pPr>
               <w:pStyle w:val="Compact"/>
-              <w:jc w:val="left"/>
             </w:pPr>
             <w:r>
               <w:t xml:space="preserve">Value</w:t>
@@ -65,7 +64,6 @@
           <w:p>
             <w:pPr>
               <w:pStyle w:val="Compact"/>
-              <w:jc w:val="left"/>
             </w:pPr>
             <w:r>
               <w:t xml:space="preserve">Version</w:t>
@@ -77,7 +75,6 @@
           <w:p>
             <w:pPr>
               <w:pStyle w:val="Compact"/>
-              <w:jc w:val="left"/>
             </w:pPr>
             <w:r>
               <w:t xml:space="preserve">recruitment-onboarding v3 · Requisition</w:t>
@@ -91,7 +88,6 @@
           <w:p>
             <w:pPr>
               <w:pStyle w:val="Compact"/>
-              <w:jc w:val="left"/>
             </w:pPr>
             <w:r>
               <w:t xml:space="preserve">Date</w:t>
@@ -104,6 +100,9 @@
             <w:pPr>
               <w:pStyle w:val="Compact"/>
             </w:pPr>
+            <w:r>
+              <w:t xml:space="preserve">2026-09-30</w:t>
+            </w:r>
           </w:p>
         </w:tc>
       </w:tr>
@@ -113,7 +112,6 @@
           <w:p>
             <w:pPr>
               <w:pStyle w:val="Compact"/>
-              <w:jc w:val="left"/>
             </w:pPr>
             <w:r>
               <w:t xml:space="preserve">Commit</w:t>
@@ -126,6 +124,14 @@
             <w:pPr>
               <w:pStyle w:val="Compact"/>
             </w:pPr>
+            <w:hyperlink r:id="rId28">
+              <w:r>
+                <w:rPr>
+                  <w:rStyle w:val="VerbatimChar"/>
+                </w:rPr>
+                <w:t xml:space="preserve">d30827b</w:t>
+              </w:r>
+            </w:hyperlink>
           </w:p>
         </w:tc>
       </w:tr>
@@ -135,7 +141,6 @@
           <w:p>
             <w:pPr>
               <w:pStyle w:val="Compact"/>
-              <w:jc w:val="left"/>
             </w:pPr>
             <w:r>
               <w:t xml:space="preserve">Status</w:t>
@@ -147,7 +152,6 @@
           <w:p>
             <w:pPr>
               <w:pStyle w:val="Compact"/>
-              <w:jc w:val="left"/>
             </w:pPr>
             <w:r>
               <w:t xml:space="preserve">Draft</w:t>
@@ -156,8 +160,8 @@
         </w:tc>
       </w:tr>
     </w:tbl>
-    <w:bookmarkEnd w:id="20"/>
-    <w:bookmarkStart w:id="21" w:name="review-sign-off"/>
+    <w:bookmarkEnd w:id="29"/>
+    <w:bookmarkStart w:id="30" w:name="review-sign-off"/>
     <w:p>
       <w:pPr>
         <w:pStyle w:val="Heading2"/>
@@ -182,14 +186,13 @@
       </w:tblGrid>
       <w:tr>
         <w:trPr>
-          <w:tblHeader w:val="true"/>
+          <w:tblHeader w:val="on"/>
         </w:trPr>
         <w:tc>
           <w:tcPr/>
           <w:p>
             <w:pPr>
               <w:pStyle w:val="Compact"/>
-              <w:jc w:val="left"/>
             </w:pPr>
             <w:r>
               <w:t xml:space="preserve">Name</w:t>
@@ -201,7 +204,6 @@
           <w:p>
             <w:pPr>
               <w:pStyle w:val="Compact"/>
-              <w:jc w:val="left"/>
             </w:pPr>
             <w:r>
               <w:t xml:space="preserve">Role / Title</w:t>
@@ -213,7 +215,6 @@
           <w:p>
             <w:pPr>
               <w:pStyle w:val="Compact"/>
-              <w:jc w:val="left"/>
             </w:pPr>
             <w:r>
               <w:t xml:space="preserve">Date</w:t>
@@ -225,7 +226,6 @@
           <w:p>
             <w:pPr>
               <w:pStyle w:val="Compact"/>
-              <w:jc w:val="left"/>
             </w:pPr>
             <w:r>
               <w:t xml:space="preserve">Review process</w:t>
@@ -237,7 +237,6 @@
           <w:p>
             <w:pPr>
               <w:pStyle w:val="Compact"/>
-              <w:jc w:val="left"/>
             </w:pPr>
             <w:r>
               <w:t xml:space="preserve">Status</w:t>
@@ -249,7 +248,6 @@
           <w:p>
             <w:pPr>
               <w:pStyle w:val="Compact"/>
-              <w:jc w:val="left"/>
             </w:pPr>
             <w:r>
               <w:t xml:space="preserve">Reference</w:t>
@@ -295,7 +293,6 @@
           <w:p>
             <w:pPr>
               <w:pStyle w:val="Compact"/>
-              <w:jc w:val="left"/>
             </w:pPr>
             <w:r>
               <w:t xml:space="preserve">Pending</w:t>
@@ -312,9 +309,9 @@
         </w:tc>
       </w:tr>
     </w:tbl>
-    <w:bookmarkEnd w:id="21"/>
-    <w:bookmarkEnd w:id="22"/>
-    <w:bookmarkStart w:id="27" w:name="the-role"/>
+    <w:bookmarkEnd w:id="30"/>
+    <w:bookmarkEnd w:id="31"/>
+    <w:bookmarkStart w:id="36" w:name="the-role"/>
     <w:p>
       <w:pPr>
         <w:pStyle w:val="Heading1"/>
@@ -323,7 +320,7 @@
         <w:t xml:space="preserve">The role</w:t>
       </w:r>
     </w:p>
-    <w:bookmarkStart w:id="23" w:name="role-summary"/>
+    <w:bookmarkStart w:id="32" w:name="role-summary"/>
     <w:p>
       <w:pPr>
         <w:pStyle w:val="Heading2"/>
@@ -340,8 +337,8 @@
         <w:t xml:space="preserve">— n/a —</w:t>
       </w:r>
     </w:p>
-    <w:bookmarkEnd w:id="23"/>
-    <w:bookmarkStart w:id="24" w:name="team-and-reporting-line"/>
+    <w:bookmarkEnd w:id="32"/>
+    <w:bookmarkStart w:id="33" w:name="team-and-reporting-line"/>
     <w:p>
       <w:pPr>
         <w:pStyle w:val="Heading2"/>
@@ -358,8 +355,8 @@
         <w:t xml:space="preserve">— n/a —</w:t>
       </w:r>
     </w:p>
-    <w:bookmarkEnd w:id="24"/>
-    <w:bookmarkStart w:id="25" w:name="key-responsibilities"/>
+    <w:bookmarkEnd w:id="33"/>
+    <w:bookmarkStart w:id="34" w:name="key-responsibilities"/>
     <w:p>
       <w:pPr>
         <w:pStyle w:val="Heading2"/>
@@ -368,8 +365,8 @@
         <w:t xml:space="preserve">Key responsibilities</w:t>
       </w:r>
     </w:p>
-    <w:bookmarkEnd w:id="25"/>
-    <w:bookmarkStart w:id="26" w:name="justification"/>
+    <w:bookmarkEnd w:id="34"/>
+    <w:bookmarkStart w:id="35" w:name="justification"/>
     <w:p>
       <w:pPr>
         <w:pStyle w:val="Heading2"/>
@@ -386,9 +383,9 @@
         <w:t xml:space="preserve">— n/a —</w:t>
       </w:r>
     </w:p>
-    <w:bookmarkEnd w:id="26"/>
-    <w:bookmarkEnd w:id="27"/>
-    <w:bookmarkStart w:id="31" w:name="engagement"/>
+    <w:bookmarkEnd w:id="35"/>
+    <w:bookmarkEnd w:id="36"/>
+    <w:bookmarkStart w:id="40" w:name="engagement"/>
     <w:p>
       <w:pPr>
         <w:pStyle w:val="Heading1"/>
@@ -397,7 +394,7 @@
         <w:t xml:space="preserve">Engagement</w:t>
       </w:r>
     </w:p>
-    <w:bookmarkStart w:id="28" w:name="engagement-type"/>
+    <w:bookmarkStart w:id="37" w:name="engagement-type"/>
     <w:p>
       <w:pPr>
         <w:pStyle w:val="Heading2"/>
@@ -414,8 +411,8 @@
         <w:t xml:space="preserve">— n/a —</w:t>
       </w:r>
     </w:p>
-    <w:bookmarkEnd w:id="28"/>
-    <w:bookmarkStart w:id="29" w:name="rationale"/>
+    <w:bookmarkEnd w:id="37"/>
+    <w:bookmarkStart w:id="38" w:name="rationale"/>
     <w:p>
       <w:pPr>
         <w:pStyle w:val="Heading2"/>
@@ -432,8 +429,8 @@
         <w:t xml:space="preserve">— n/a —</w:t>
       </w:r>
     </w:p>
-    <w:bookmarkEnd w:id="29"/>
-    <w:bookmarkStart w:id="30" w:name="Xf58ffec67de27dad2479f3f19eda26c5e0c7af1"/>
+    <w:bookmarkEnd w:id="38"/>
+    <w:bookmarkStart w:id="39" w:name="Xf58ffec67de27dad2479f3f19eda26c5e0c7af1"/>
     <w:p>
       <w:pPr>
         <w:pStyle w:val="Heading2"/>
@@ -450,9 +447,9 @@
         <w:t xml:space="preserve">— not stated —</w:t>
       </w:r>
     </w:p>
-    <w:bookmarkEnd w:id="30"/>
-    <w:bookmarkEnd w:id="31"/>
-    <w:bookmarkStart w:id="33" w:name="role-evaluation"/>
+    <w:bookmarkEnd w:id="39"/>
+    <w:bookmarkEnd w:id="40"/>
+    <w:bookmarkStart w:id="42" w:name="role-evaluation"/>
     <w:p>
       <w:pPr>
         <w:pStyle w:val="Heading1"/>
@@ -461,7 +458,7 @@
         <w:t xml:space="preserve">Role evaluation</w:t>
       </w:r>
     </w:p>
-    <w:bookmarkStart w:id="32" w:name="outcome"/>
+    <w:bookmarkStart w:id="41" w:name="outcome"/>
     <w:p>
       <w:pPr>
         <w:pStyle w:val="Heading2"/>
@@ -478,9 +475,9 @@
         <w:t xml:space="preserve">— n/a —</w:t>
       </w:r>
     </w:p>
-    <w:bookmarkEnd w:id="32"/>
-    <w:bookmarkEnd w:id="33"/>
-    <w:bookmarkStart w:id="34" w:name="how-the-role-was-evaluated"/>
+    <w:bookmarkEnd w:id="41"/>
+    <w:bookmarkEnd w:id="42"/>
+    <w:bookmarkStart w:id="43" w:name="how-the-role-was-evaluated"/>
     <w:p>
       <w:pPr>
         <w:pStyle w:val="Heading1"/>
@@ -497,13 +494,13 @@
         <w:t xml:space="preserve">— n/a —</w:t>
       </w:r>
     </w:p>
-    <w:bookmarkEnd w:id="34"/>
+    <w:bookmarkEnd w:id="43"/>
     <w:sectPr>
-      <w:headerReference r:id="rId11" w:type="even"/>
-      <w:headerReference r:id="rId10" w:type="default"/>
-      <w:footerReference r:id="rId12" w:type="default"/>
-      <w:headerReference r:id="rId9" w:type="first"/>
-      <w:footerReference r:id="rId13" w:type="first"/>
+      <w:headerReference r:id="rId15" w:type="even"/>
+      <w:headerReference r:id="rId16" w:type="default"/>
+      <w:footerReference r:id="rId17" w:type="default"/>
+      <w:headerReference r:id="rId18" w:type="first"/>
+      <w:footerReference r:id="rId19" w:type="first"/>
       <w:pgSz w:code="9" w:h="16838" w:w="11906"/>
       <w:pgMar w:bottom="1440" w:footer="709" w:gutter="0" w:header="709" w:left="1440" w:right="1440" w:top="1440"/>
       <w:cols w:space="708"/>
@@ -4690,14 +4687,14 @@
     </w:lvl>
   </w:abstractNum>
   <w:abstractNum w:abstractNumId="990">
-    <w:nsid w:val="A990"/>
+    <w:nsid w:val="0000A990"/>
     <w:multiLevelType w:val="multilevel"/>
     <w:lvl w:ilvl="0">
       <w:numFmt w:val="bullet"/>
       <w:lvlText w:val=" "/>
       <w:lvlJc w:val="left"/>
       <w:pPr>
-        <w:ind w:left="720" w:hanging="480"/>
+        <w:ind w:left="720" w:hanging="360"/>
       </w:pPr>
     </w:lvl>
     <w:lvl w:ilvl="1">
@@ -4705,7 +4702,7 @@
       <w:lvlText w:val=" "/>
       <w:lvlJc w:val="left"/>
       <w:pPr>
-        <w:ind w:left="1440" w:hanging="480"/>
+        <w:ind w:left="1440" w:hanging="360"/>
       </w:pPr>
     </w:lvl>
     <w:lvl w:ilvl="2">
@@ -4713,7 +4710,7 @@
       <w:lvlText w:val=" "/>
       <w:lvlJc w:val="left"/>
       <w:pPr>
-        <w:ind w:left="2160" w:hanging="480"/>
+        <w:ind w:left="2160" w:hanging="360"/>
       </w:pPr>
     </w:lvl>
     <w:lvl w:ilvl="3">
@@ -4721,7 +4718,7 @@
       <w:lvlText w:val=" "/>
       <w:lvlJc w:val="left"/>
       <w:pPr>
-        <w:ind w:left="2880" w:hanging="480"/>
+        <w:ind w:left="2880" w:hanging="360"/>
       </w:pPr>
     </w:lvl>
     <w:lvl w:ilvl="4">
@@ -4729,7 +4726,7 @@
       <w:lvlText w:val=" "/>
       <w:lvlJc w:val="left"/>
       <w:pPr>
-        <w:ind w:left="3600" w:hanging="480"/>
+        <w:ind w:left="3600" w:hanging="360"/>
       </w:pPr>
     </w:lvl>
     <w:lvl w:ilvl="5">
@@ -4737,7 +4734,7 @@
       <w:lvlText w:val=" "/>
       <w:lvlJc w:val="left"/>
       <w:pPr>
-        <w:ind w:left="4320" w:hanging="480"/>
+        <w:ind w:left="4320" w:hanging="360"/>
       </w:pPr>
     </w:lvl>
     <w:lvl w:ilvl="6">
@@ -4745,7 +4742,7 @@
       <w:lvlText w:val=" "/>
       <w:lvlJc w:val="left"/>
       <w:pPr>
-        <w:ind w:left="5040" w:hanging="480"/>
+        <w:ind w:left="5040" w:hanging="360"/>
       </w:pPr>
     </w:lvl>
     <w:lvl w:ilvl="7">
@@ -4753,7 +4750,7 @@
       <w:lvlText w:val=" "/>
       <w:lvlJc w:val="left"/>
       <w:pPr>
-        <w:ind w:left="5760" w:hanging="480"/>
+        <w:ind w:left="5760" w:hanging="360"/>
       </w:pPr>
     </w:lvl>
     <w:lvl w:ilvl="8">
@@ -4761,7 +4758,7 @@
       <w:lvlText w:val=" "/>
       <w:lvlJc w:val="left"/>
       <w:pPr>
-        <w:ind w:left="6480" w:hanging="480"/>
+        <w:ind w:left="6480" w:hanging="360"/>
       </w:pPr>
     </w:lvl>
   </w:abstractNum>
@@ -21040,8 +21037,8 @@
     <w:name w:val="KeywordTok"/>
     <w:basedOn w:val="VerbatimChar"/>
     <w:rPr>
+      <w:b/>
       <w:color w:val="007020"/>
-      <w:b/>
     </w:rPr>
   </w:style>
   <w:style w:type="character" w:customStyle="1" w:styleId="DataTypeTok">
@@ -21118,42 +21115,42 @@
     <w:name w:val="ImportTok"/>
     <w:basedOn w:val="VerbatimChar"/>
     <w:rPr>
+      <w:b/>
       <w:color w:val="008000"/>
-      <w:b/>
     </w:rPr>
   </w:style>
   <w:style w:type="character" w:customStyle="1" w:styleId="CommentTok">
     <w:name w:val="CommentTok"/>
     <w:basedOn w:val="VerbatimChar"/>
     <w:rPr>
+      <w:i/>
       <w:color w:val="60a0b0"/>
-      <w:i/>
     </w:rPr>
   </w:style>
   <w:style w:type="character" w:customStyle="1" w:styleId="DocumentationTok">
     <w:name w:val="DocumentationTok"/>
     <w:basedOn w:val="VerbatimChar"/>
     <w:rPr>
+      <w:i/>
       <w:color w:val="ba2121"/>
-      <w:i/>
     </w:rPr>
   </w:style>
   <w:style w:type="character" w:customStyle="1" w:styleId="AnnotationTok">
     <w:name w:val="AnnotationTok"/>
     <w:basedOn w:val="VerbatimChar"/>
     <w:rPr>
-      <w:color w:val="60a0b0"/>
       <w:b/>
       <w:i/>
+      <w:color w:val="60a0b0"/>
     </w:rPr>
   </w:style>
   <w:style w:type="character" w:customStyle="1" w:styleId="CommentVarTok">
     <w:name w:val="CommentVarTok"/>
     <w:basedOn w:val="VerbatimChar"/>
     <w:rPr>
-      <w:color w:val="60a0b0"/>
       <w:b/>
       <w:i/>
+      <w:color w:val="60a0b0"/>
     </w:rPr>
   </w:style>
   <w:style w:type="character" w:customStyle="1" w:styleId="OtherTok">
@@ -21181,8 +21178,8 @@
     <w:name w:val="ControlFlowTok"/>
     <w:basedOn w:val="VerbatimChar"/>
     <w:rPr>
+      <w:b/>
       <w:color w:val="007020"/>
-      <w:b/>
     </w:rPr>
   </w:style>
   <w:style w:type="character" w:customStyle="1" w:styleId="OperatorTok">
@@ -21227,34 +21224,34 @@
     <w:name w:val="InformationTok"/>
     <w:basedOn w:val="VerbatimChar"/>
     <w:rPr>
-      <w:color w:val="60a0b0"/>
       <w:b/>
       <w:i/>
+      <w:color w:val="60a0b0"/>
     </w:rPr>
   </w:style>
   <w:style w:type="character" w:customStyle="1" w:styleId="WarningTok">
     <w:name w:val="WarningTok"/>
     <w:basedOn w:val="VerbatimChar"/>
     <w:rPr>
-      <w:color w:val="60a0b0"/>
       <w:b/>
       <w:i/>
+      <w:color w:val="60a0b0"/>
     </w:rPr>
   </w:style>
   <w:style w:type="character" w:customStyle="1" w:styleId="AlertTok">
     <w:name w:val="AlertTok"/>
     <w:basedOn w:val="VerbatimChar"/>
     <w:rPr>
+      <w:b/>
       <w:color w:val="ff0000"/>
-      <w:b/>
     </w:rPr>
   </w:style>
   <w:style w:type="character" w:customStyle="1" w:styleId="ErrorTok">
     <w:name w:val="ErrorTok"/>
     <w:basedOn w:val="VerbatimChar"/>
     <w:rPr>
+      <w:b/>
       <w:color w:val="ff0000"/>
-      <w:b/>
     </w:rPr>
   </w:style>
   <w:style w:type="character" w:customStyle="1" w:styleId="NormalTok">

</xml_diff>